<commit_message>
Fixed sidebar navigation, added title selector in enquiry form
</commit_message>
<xml_diff>
--- a/documents/templates/stp_quotation_template.docx
+++ b/documents/templates/stp_quotation_template.docx
@@ -363,7 +363,7 @@
           <w:szCs w:val="26"/>
           <w:vertAlign w:val="baseline"/>
         </w:rPr>
-        <w:t>Kind Attn: Mr {{ attn_name }}</w:t>
+        <w:t>Kind Attn: {{ attn_name }}</w:t>
       </w:r>
       <w:proofErr w:type="spellStart"/>
       <w:r>
@@ -596,7 +596,7 @@
           <w:szCs w:val="26"/>
           <w:vertAlign w:val="baseline"/>
         </w:rPr>
-        <w:t>Dear Sir,</w:t>
+        <w:t>Dear Sir/Madam,</w:t>
       </w:r>
     </w:p>
     <w:p>

</xml_diff>